<commit_message>
Update submission documents with team details
</commit_message>
<xml_diff>
--- a/docs/submission/SMYA_商业方案_施工日报智能代理.docx
+++ b/docs/submission/SMYA_商业方案_施工日报智能代理.docx
@@ -187,7 +187,7 @@
                 <w:color w:val="000000"/>
                 <w:sz w:val="18"/>
               </w:rPr>
-              <w:t>[团队代码]</w:t>
+              <w:t>DCY214XK</w:t>
             </w:r>
           </w:p>
         </w:tc>
@@ -246,7 +246,7 @@
                 <w:color w:val="000000"/>
                 <w:sz w:val="18"/>
               </w:rPr>
-              <w:t>[团队名称]</w:t>
+              <w:t>GEOpilot</w:t>
             </w:r>
           </w:p>
         </w:tc>
@@ -303,7 +303,7 @@
                 <w:color w:val="000000"/>
                 <w:sz w:val="18"/>
               </w:rPr>
-              <w:t>[团队成员]</w:t>
+              <w:t>Kaede Iijima; SHI JING; XIE RANYI; Yelin Zhong</w:t>
             </w:r>
           </w:p>
         </w:tc>
@@ -362,7 +362,7 @@
                 <w:color w:val="000000"/>
                 <w:sz w:val="18"/>
               </w:rPr>
-              <w:t>Site Daily Report Agent 施工日报智能代理</w:t>
+              <w:t>GEOpilot - Site Daily Report Agent</w:t>
             </w:r>
           </w:p>
         </w:tc>
@@ -478,7 +478,7 @@
                 <w:color w:val="000000"/>
                 <w:sz w:val="18"/>
               </w:rPr>
-              <w:t>[GITHUB URL]</w:t>
+              <w:t>https://github.com/Ranyix0302/GEOpilot_site-daily-report-agent</w:t>
             </w:r>
           </w:p>
         </w:tc>
@@ -957,7 +957,7 @@
           <w:color w:val="000000"/>
           <w:sz w:val="20"/>
         </w:rPr>
-        <w:t>我们设计 Site Daily Report Agent 施工日报智能代理，用于完成重复且规则明确的准备工作。系统接收导出的 WhatsApp 文本和媒体文件，提取所需字段，按桩号合并记录，标记缺失和冲突，并生成可编辑预览。工程师仍负责核对原始证据和批准最终结果，确认后的数据可以直接写入公司的飞书多维表格。</w:t>
+        <w:t>我们设计 GEOpilot - Site Daily Report Agent，用于完成重复且规则明确的准备工作。系统接收导出的 WhatsApp 文本和媒体文件，提取所需字段，按桩号合并记录，标记缺失和冲突，并生成可编辑预览。工程师仍负责核对原始证据和批准最终结果，确认后的数据可以直接写入公司的飞书多维表格。</w:t>
       </w:r>
     </w:p>
     <w:p>
@@ -5312,6 +5312,7 @@
     </w:p>
     <w:sectPr>
       <w:footerReference w:type="default" r:id="rId9"/>
+      <w:headerReference w:type="default" r:id="rId10"/>
       <w:pgSz w:w="11906" w:h="16838"/>
       <w:pgMar w:top="1077" w:right="1134" w:bottom="1020" w:left="1134" w:header="720" w:footer="720" w:gutter="0"/>
       <w:cols w:space="720"/>
@@ -5376,6 +5377,16 @@
     </w:r>
   </w:p>
 </w:ftr>
+</file>
+
+<file path=word/header1.xml><?xml version="1.0" encoding="utf-8"?>
+<w:hdr xmlns:m="http://schemas.openxmlformats.org/officeDocument/2006/math" xmlns:mc="http://schemas.openxmlformats.org/markup-compatibility/2006" xmlns:mo="http://schemas.microsoft.com/office/mac/office/2008/main" xmlns:mv="urn:schemas-microsoft-com:mac:vml" xmlns:o="urn:schemas-microsoft-com:office:office" xmlns:r="http://schemas.openxmlformats.org/officeDocument/2006/relationships" xmlns:v="urn:schemas-microsoft-com:vml" xmlns:w10="urn:schemas-microsoft-com:office:word" xmlns:w14="http://schemas.microsoft.com/office/word/2010/wordml" xmlns:w="http://schemas.openxmlformats.org/wordprocessingml/2006/main" xmlns:wne="http://schemas.microsoft.com/office/word/2006/wordml" xmlns:wp14="http://schemas.microsoft.com/office/word/2010/wordprocessingDrawing" xmlns:wp="http://schemas.openxmlformats.org/drawingml/2006/wordprocessingDrawing" xmlns:wpc="http://schemas.microsoft.com/office/word/2010/wordprocessingCanvas" xmlns:wpg="http://schemas.microsoft.com/office/word/2010/wordprocessingGroup" xmlns:wpi="http://schemas.microsoft.com/office/word/2010/wordprocessingInk" xmlns:wps="http://schemas.microsoft.com/office/word/2010/wordprocessingShape" mc:Ignorable="w14 wp14">
+  <w:p>
+    <w:pPr>
+      <w:pStyle w:val="Header"/>
+    </w:pPr>
+  </w:p>
+</w:hdr>
 </file>
 
 <file path=word/numbering.xml><?xml version="1.0" encoding="utf-8"?>

</xml_diff>